<commit_message>
Use Times New Roman for manuscript outputs
</commit_message>
<xml_diff>
--- a/manuscript/journal_submission/marine_environmental_research/rendered_v6/mer_manuscript_unblinded_v6.docx
+++ b/manuscript/journal_submission/marine_environmental_research/rendered_v6/mer_manuscript_unblinded_v6.docx
@@ -4121,7 +4121,7 @@
   <w:docDefaults>
     <w:rPrDefault>
       <w:rPr>
-        <w:rFonts w:asciiTheme="minorHAnsi" w:cstheme="minorBidi" w:eastAsiaTheme="minorHAnsi" w:hAnsiTheme="minorHAnsi"/>
+        <w:rFonts w:ascii="Times New Roman" w:cs="Times New Roman" w:eastAsia="Times New Roman" w:hAnsi="Times New Roman"/>
         <w:sz w:val="24"/>
         <w:szCs w:val="24"/>
         <w:lang w:bidi="ar-SA" w:eastAsia="en-US" w:val="en"/>
@@ -4175,7 +4175,7 @@
       <w:jc w:val="center"/>
     </w:pPr>
     <w:rPr>
-      <w:rFonts w:asciiTheme="majorHAnsi" w:cstheme="majorBidi" w:eastAsiaTheme="majorEastAsia" w:hAnsiTheme="majorHAnsi"/>
+      <w:rFonts w:ascii="Times New Roman" w:cs="Times New Roman" w:eastAsia="Times New Roman" w:hAnsi="Times New Roman"/>
       <w:spacing w:val="-10"/>
       <w:kern w:val="28"/>
       <w:sz w:val="56"/>
@@ -4189,7 +4189,7 @@
     <w:uiPriority w:val="10"/>
     <w:rsid w:val="00A10FD9"/>
     <w:rPr>
-      <w:rFonts w:asciiTheme="majorHAnsi" w:cstheme="majorBidi" w:eastAsiaTheme="majorEastAsia" w:hAnsiTheme="majorHAnsi"/>
+      <w:rFonts w:ascii="Times New Roman" w:cs="Times New Roman" w:eastAsia="Times New Roman" w:hAnsi="Times New Roman"/>
       <w:spacing w:val="-10"/>
       <w:kern w:val="28"/>
       <w:sz w:val="56"/>
@@ -4210,7 +4210,7 @@
       </w:numPr>
     </w:pPr>
     <w:rPr>
-      <w:rFonts w:cstheme="majorBidi" w:eastAsiaTheme="majorEastAsia"/>
+      <w:rFonts w:ascii="Times New Roman" w:cs="Times New Roman" w:eastAsia="Times New Roman" w:hAnsi="Times New Roman"/>
       <w:color w:themeColor="text1" w:themeTint="A6" w:val="595959"/>
       <w:spacing w:val="15"/>
       <w:sz w:val="28"/>
@@ -4224,7 +4224,7 @@
     <w:uiPriority w:val="11"/>
     <w:rsid w:val="00A10FD9"/>
     <w:rPr>
-      <w:rFonts w:cstheme="majorBidi" w:eastAsiaTheme="majorEastAsia"/>
+      <w:rFonts w:ascii="Times New Roman" w:cs="Times New Roman" w:eastAsia="Times New Roman" w:hAnsi="Times New Roman"/>
       <w:color w:themeColor="text1" w:themeTint="A6" w:val="595959"/>
       <w:spacing w:val="15"/>
       <w:sz w:val="28"/>
@@ -4307,7 +4307,7 @@
       <w:outlineLvl w:val="0"/>
     </w:pPr>
     <w:rPr>
-      <w:rFonts w:asciiTheme="majorHAnsi" w:cstheme="majorBidi" w:eastAsiaTheme="majorEastAsia" w:hAnsiTheme="majorHAnsi"/>
+      <w:rFonts w:ascii="Times New Roman" w:cs="Times New Roman" w:eastAsia="Times New Roman" w:hAnsi="Times New Roman"/>
       <w:color w:themeColor="accent1" w:themeShade="BF" w:val="0F4761"/>
       <w:sz w:val="40"/>
       <w:szCs w:val="40"/>
@@ -4330,7 +4330,7 @@
       <w:outlineLvl w:val="1"/>
     </w:pPr>
     <w:rPr>
-      <w:rFonts w:asciiTheme="majorHAnsi" w:cstheme="majorBidi" w:eastAsiaTheme="majorEastAsia" w:hAnsiTheme="majorHAnsi"/>
+      <w:rFonts w:ascii="Times New Roman" w:cs="Times New Roman" w:eastAsia="Times New Roman" w:hAnsi="Times New Roman"/>
       <w:color w:themeColor="accent1" w:themeShade="BF" w:val="0F4761"/>
       <w:sz w:val="32"/>
       <w:szCs w:val="32"/>
@@ -4353,7 +4353,7 @@
       <w:outlineLvl w:val="2"/>
     </w:pPr>
     <w:rPr>
-      <w:rFonts w:cstheme="majorBidi" w:eastAsiaTheme="majorEastAsia"/>
+      <w:rFonts w:ascii="Times New Roman" w:cs="Times New Roman" w:eastAsia="Times New Roman" w:hAnsi="Times New Roman"/>
       <w:color w:themeColor="accent1" w:themeShade="BF" w:val="0F4761"/>
       <w:sz w:val="28"/>
       <w:szCs w:val="28"/>
@@ -4376,7 +4376,7 @@
       <w:outlineLvl w:val="3"/>
     </w:pPr>
     <w:rPr>
-      <w:rFonts w:cstheme="majorBidi" w:eastAsiaTheme="majorEastAsia"/>
+      <w:rFonts w:ascii="Times New Roman" w:cs="Times New Roman" w:eastAsia="Times New Roman" w:hAnsi="Times New Roman"/>
       <w:i/>
       <w:iCs/>
       <w:color w:themeColor="accent1" w:themeShade="BF" w:val="0F4761"/>
@@ -4399,7 +4399,7 @@
       <w:outlineLvl w:val="4"/>
     </w:pPr>
     <w:rPr>
-      <w:rFonts w:cstheme="majorBidi" w:eastAsiaTheme="majorEastAsia"/>
+      <w:rFonts w:ascii="Times New Roman" w:cs="Times New Roman" w:eastAsia="Times New Roman" w:hAnsi="Times New Roman"/>
       <w:color w:themeColor="accent1" w:themeShade="BF" w:val="0F4761"/>
     </w:rPr>
   </w:style>
@@ -4420,7 +4420,7 @@
       <w:outlineLvl w:val="5"/>
     </w:pPr>
     <w:rPr>
-      <w:rFonts w:cstheme="majorBidi" w:eastAsiaTheme="majorEastAsia"/>
+      <w:rFonts w:ascii="Times New Roman" w:cs="Times New Roman" w:eastAsia="Times New Roman" w:hAnsi="Times New Roman"/>
       <w:i/>
       <w:iCs/>
       <w:color w:themeColor="text1" w:themeTint="A6" w:val="595959"/>
@@ -4443,7 +4443,7 @@
       <w:outlineLvl w:val="6"/>
     </w:pPr>
     <w:rPr>
-      <w:rFonts w:cstheme="majorBidi" w:eastAsiaTheme="majorEastAsia"/>
+      <w:rFonts w:ascii="Times New Roman" w:cs="Times New Roman" w:eastAsia="Times New Roman" w:hAnsi="Times New Roman"/>
       <w:color w:themeColor="text1" w:themeTint="A6" w:val="595959"/>
     </w:rPr>
   </w:style>
@@ -4464,7 +4464,7 @@
       <w:outlineLvl w:val="7"/>
     </w:pPr>
     <w:rPr>
-      <w:rFonts w:cstheme="majorBidi" w:eastAsiaTheme="majorEastAsia"/>
+      <w:rFonts w:ascii="Times New Roman" w:cs="Times New Roman" w:eastAsia="Times New Roman" w:hAnsi="Times New Roman"/>
       <w:i/>
       <w:iCs/>
       <w:color w:themeColor="text1" w:themeTint="D8" w:val="272727"/>
@@ -4487,7 +4487,7 @@
       <w:outlineLvl w:val="8"/>
     </w:pPr>
     <w:rPr>
-      <w:rFonts w:cstheme="majorBidi" w:eastAsiaTheme="majorEastAsia"/>
+      <w:rFonts w:ascii="Times New Roman" w:cs="Times New Roman" w:eastAsia="Times New Roman" w:hAnsi="Times New Roman"/>
       <w:color w:themeColor="text1" w:themeTint="D8" w:val="272727"/>
     </w:rPr>
   </w:style>
@@ -4498,7 +4498,7 @@
     <w:uiPriority w:val="9"/>
     <w:rsid w:val="00A10FD9"/>
     <w:rPr>
-      <w:rFonts w:asciiTheme="majorHAnsi" w:cstheme="majorBidi" w:eastAsiaTheme="majorEastAsia" w:hAnsiTheme="majorHAnsi"/>
+      <w:rFonts w:ascii="Times New Roman" w:cs="Times New Roman" w:eastAsia="Times New Roman" w:hAnsi="Times New Roman"/>
       <w:color w:themeColor="accent1" w:themeShade="BF" w:val="0F4761"/>
       <w:sz w:val="40"/>
       <w:szCs w:val="40"/>
@@ -4512,7 +4512,7 @@
     <w:semiHidden/>
     <w:rsid w:val="00A10FD9"/>
     <w:rPr>
-      <w:rFonts w:asciiTheme="majorHAnsi" w:cstheme="majorBidi" w:eastAsiaTheme="majorEastAsia" w:hAnsiTheme="majorHAnsi"/>
+      <w:rFonts w:ascii="Times New Roman" w:cs="Times New Roman" w:eastAsia="Times New Roman" w:hAnsi="Times New Roman"/>
       <w:color w:themeColor="accent1" w:themeShade="BF" w:val="0F4761"/>
       <w:sz w:val="32"/>
       <w:szCs w:val="32"/>
@@ -4526,7 +4526,7 @@
     <w:semiHidden/>
     <w:rsid w:val="00A10FD9"/>
     <w:rPr>
-      <w:rFonts w:cstheme="majorBidi" w:eastAsiaTheme="majorEastAsia"/>
+      <w:rFonts w:ascii="Times New Roman" w:cs="Times New Roman" w:eastAsia="Times New Roman" w:hAnsi="Times New Roman"/>
       <w:color w:themeColor="accent1" w:themeShade="BF" w:val="0F4761"/>
       <w:sz w:val="28"/>
       <w:szCs w:val="28"/>
@@ -4540,7 +4540,7 @@
     <w:semiHidden/>
     <w:rsid w:val="00A10FD9"/>
     <w:rPr>
-      <w:rFonts w:cstheme="majorBidi" w:eastAsiaTheme="majorEastAsia"/>
+      <w:rFonts w:ascii="Times New Roman" w:cs="Times New Roman" w:eastAsia="Times New Roman" w:hAnsi="Times New Roman"/>
       <w:i/>
       <w:iCs/>
       <w:color w:themeColor="accent1" w:themeShade="BF" w:val="0F4761"/>
@@ -4554,7 +4554,7 @@
     <w:semiHidden/>
     <w:rsid w:val="00A10FD9"/>
     <w:rPr>
-      <w:rFonts w:cstheme="majorBidi" w:eastAsiaTheme="majorEastAsia"/>
+      <w:rFonts w:ascii="Times New Roman" w:cs="Times New Roman" w:eastAsia="Times New Roman" w:hAnsi="Times New Roman"/>
       <w:color w:themeColor="accent1" w:themeShade="BF" w:val="0F4761"/>
     </w:rPr>
   </w:style>
@@ -4566,7 +4566,7 @@
     <w:semiHidden/>
     <w:rsid w:val="00A10FD9"/>
     <w:rPr>
-      <w:rFonts w:cstheme="majorBidi" w:eastAsiaTheme="majorEastAsia"/>
+      <w:rFonts w:ascii="Times New Roman" w:cs="Times New Roman" w:eastAsia="Times New Roman" w:hAnsi="Times New Roman"/>
       <w:i/>
       <w:iCs/>
       <w:color w:themeColor="text1" w:themeTint="A6" w:val="595959"/>
@@ -4580,7 +4580,7 @@
     <w:semiHidden/>
     <w:rsid w:val="00A10FD9"/>
     <w:rPr>
-      <w:rFonts w:cstheme="majorBidi" w:eastAsiaTheme="majorEastAsia"/>
+      <w:rFonts w:ascii="Times New Roman" w:cs="Times New Roman" w:eastAsia="Times New Roman" w:hAnsi="Times New Roman"/>
       <w:color w:themeColor="text1" w:themeTint="A6" w:val="595959"/>
     </w:rPr>
   </w:style>
@@ -4592,7 +4592,7 @@
     <w:semiHidden/>
     <w:rsid w:val="00A10FD9"/>
     <w:rPr>
-      <w:rFonts w:cstheme="majorBidi" w:eastAsiaTheme="majorEastAsia"/>
+      <w:rFonts w:ascii="Times New Roman" w:cs="Times New Roman" w:eastAsia="Times New Roman" w:hAnsi="Times New Roman"/>
       <w:i/>
       <w:iCs/>
       <w:color w:themeColor="text1" w:themeTint="D8" w:val="272727"/>
@@ -4606,7 +4606,7 @@
     <w:semiHidden/>
     <w:rsid w:val="00A10FD9"/>
     <w:rPr>
-      <w:rFonts w:cstheme="majorBidi" w:eastAsiaTheme="majorEastAsia"/>
+      <w:rFonts w:ascii="Times New Roman" w:cs="Times New Roman" w:eastAsia="Times New Roman" w:hAnsi="Times New Roman"/>
       <w:color w:themeColor="text1" w:themeTint="D8" w:val="272727"/>
     </w:rPr>
   </w:style>
@@ -4737,7 +4737,7 @@
     <w:name w:val="Verbatim Char"/>
     <w:basedOn w:val="BodyTextChar"/>
     <w:rPr>
-      <w:rFonts w:ascii="Consolas" w:hAnsi="Consolas"/>
+      <w:rFonts w:ascii="Times New Roman" w:cs="Times New Roman" w:eastAsia="Times New Roman" w:hAnsi="Times New Roman"/>
       <w:sz w:val="22"/>
     </w:rPr>
   </w:style>
@@ -4771,7 +4771,7 @@
       <w:outlineLvl w:val="9"/>
     </w:pPr>
     <w:rPr>
-      <w:rFonts w:asciiTheme="majorHAnsi" w:cstheme="majorBidi" w:eastAsiaTheme="majorEastAsia" w:hAnsiTheme="majorHAnsi"/>
+      <w:rFonts w:ascii="Times New Roman" w:cs="Times New Roman" w:eastAsia="Times New Roman" w:hAnsi="Times New Roman"/>
       <w:b w:val="0"/>
       <w:bCs w:val="0"/>
       <w:color w:themeColor="accent1" w:themeShade="BF" w:val="365F91"/>
@@ -5085,108 +5085,108 @@
     </a:clrScheme>
     <a:fontScheme name="Office">
       <a:majorFont>
-        <a:latin typeface="Aptos Display" panose="02110004020202020204"/>
-        <a:ea typeface=""/>
-        <a:cs typeface=""/>
-        <a:font script="Jpan" typeface="游ゴシック Light"/>
-        <a:font script="Hang" typeface="맑은 고딕"/>
-        <a:font script="Hans" typeface="等线 Light"/>
-        <a:font script="Hant" typeface="新細明體"/>
+        <a:latin typeface="Times New Roman" panose="02110004020202020204"/>
+        <a:ea typeface="Times New Roman"/>
+        <a:cs typeface="Times New Roman"/>
+        <a:font script="Jpan" typeface="Times New Roman"/>
+        <a:font script="Hang" typeface="Times New Roman"/>
+        <a:font script="Hans" typeface="Times New Roman"/>
+        <a:font script="Hant" typeface="Times New Roman"/>
         <a:font script="Arab" typeface="Times New Roman"/>
         <a:font script="Hebr" typeface="Times New Roman"/>
-        <a:font script="Thai" typeface="Angsana New"/>
-        <a:font script="Ethi" typeface="Nyala"/>
-        <a:font script="Beng" typeface="Vrinda"/>
-        <a:font script="Gujr" typeface="Shruti"/>
-        <a:font script="Khmr" typeface="MoolBoran"/>
-        <a:font script="Knda" typeface="Tunga"/>
-        <a:font script="Guru" typeface="Raavi"/>
-        <a:font script="Cans" typeface="Euphemia"/>
-        <a:font script="Cher" typeface="Plantagenet Cherokee"/>
-        <a:font script="Yiii" typeface="Microsoft Yi Baiti"/>
-        <a:font script="Tibt" typeface="Microsoft Himalaya"/>
-        <a:font script="Thaa" typeface="MV Boli"/>
-        <a:font script="Deva" typeface="Mangal"/>
-        <a:font script="Telu" typeface="Gautami"/>
-        <a:font script="Taml" typeface="Latha"/>
-        <a:font script="Syrc" typeface="Estrangelo Edessa"/>
-        <a:font script="Orya" typeface="Kalinga"/>
-        <a:font script="Mlym" typeface="Kartika"/>
-        <a:font script="Laoo" typeface="DokChampa"/>
-        <a:font script="Sinh" typeface="Iskoola Pota"/>
-        <a:font script="Mong" typeface="Mongolian Baiti"/>
+        <a:font script="Thai" typeface="Times New Roman"/>
+        <a:font script="Ethi" typeface="Times New Roman"/>
+        <a:font script="Beng" typeface="Times New Roman"/>
+        <a:font script="Gujr" typeface="Times New Roman"/>
+        <a:font script="Khmr" typeface="Times New Roman"/>
+        <a:font script="Knda" typeface="Times New Roman"/>
+        <a:font script="Guru" typeface="Times New Roman"/>
+        <a:font script="Cans" typeface="Times New Roman"/>
+        <a:font script="Cher" typeface="Times New Roman"/>
+        <a:font script="Yiii" typeface="Times New Roman"/>
+        <a:font script="Tibt" typeface="Times New Roman"/>
+        <a:font script="Thaa" typeface="Times New Roman"/>
+        <a:font script="Deva" typeface="Times New Roman"/>
+        <a:font script="Telu" typeface="Times New Roman"/>
+        <a:font script="Taml" typeface="Times New Roman"/>
+        <a:font script="Syrc" typeface="Times New Roman"/>
+        <a:font script="Orya" typeface="Times New Roman"/>
+        <a:font script="Mlym" typeface="Times New Roman"/>
+        <a:font script="Laoo" typeface="Times New Roman"/>
+        <a:font script="Sinh" typeface="Times New Roman"/>
+        <a:font script="Mong" typeface="Times New Roman"/>
         <a:font script="Viet" typeface="Times New Roman"/>
-        <a:font script="Uigh" typeface="Microsoft Uighur"/>
-        <a:font script="Geor" typeface="Sylfaen"/>
-        <a:font script="Armn" typeface="Arial"/>
-        <a:font script="Bugi" typeface="Leelawadee UI"/>
-        <a:font script="Bopo" typeface="Microsoft JhengHei"/>
-        <a:font script="Java" typeface="Javanese Text"/>
-        <a:font script="Lisu" typeface="Segoe UI"/>
-        <a:font script="Mymr" typeface="Myanmar Text"/>
-        <a:font script="Nkoo" typeface="Ebrima"/>
-        <a:font script="Olck" typeface="Nirmala UI"/>
-        <a:font script="Osma" typeface="Ebrima"/>
-        <a:font script="Phag" typeface="Phagspa"/>
-        <a:font script="Syrn" typeface="Estrangelo Edessa"/>
-        <a:font script="Syrj" typeface="Estrangelo Edessa"/>
-        <a:font script="Syre" typeface="Estrangelo Edessa"/>
-        <a:font script="Sora" typeface="Nirmala UI"/>
-        <a:font script="Tale" typeface="Microsoft Tai Le"/>
-        <a:font script="Talu" typeface="Microsoft New Tai Lue"/>
-        <a:font script="Tfng" typeface="Ebrima"/>
+        <a:font script="Uigh" typeface="Times New Roman"/>
+        <a:font script="Geor" typeface="Times New Roman"/>
+        <a:font script="Armn" typeface="Times New Roman"/>
+        <a:font script="Bugi" typeface="Times New Roman"/>
+        <a:font script="Bopo" typeface="Times New Roman"/>
+        <a:font script="Java" typeface="Times New Roman"/>
+        <a:font script="Lisu" typeface="Times New Roman"/>
+        <a:font script="Mymr" typeface="Times New Roman"/>
+        <a:font script="Nkoo" typeface="Times New Roman"/>
+        <a:font script="Olck" typeface="Times New Roman"/>
+        <a:font script="Osma" typeface="Times New Roman"/>
+        <a:font script="Phag" typeface="Times New Roman"/>
+        <a:font script="Syrn" typeface="Times New Roman"/>
+        <a:font script="Syrj" typeface="Times New Roman"/>
+        <a:font script="Syre" typeface="Times New Roman"/>
+        <a:font script="Sora" typeface="Times New Roman"/>
+        <a:font script="Tale" typeface="Times New Roman"/>
+        <a:font script="Talu" typeface="Times New Roman"/>
+        <a:font script="Tfng" typeface="Times New Roman"/>
       </a:majorFont>
       <a:minorFont>
-        <a:latin typeface="Aptos" panose="02110004020202020204"/>
-        <a:ea typeface=""/>
-        <a:cs typeface=""/>
-        <a:font script="Jpan" typeface="游明朝"/>
-        <a:font script="Hang" typeface="맑은 고딕"/>
-        <a:font script="Hans" typeface="等线"/>
-        <a:font script="Hant" typeface="新細明體"/>
-        <a:font script="Arab" typeface="Arial"/>
-        <a:font script="Hebr" typeface="Arial"/>
-        <a:font script="Thai" typeface="Cordia New"/>
-        <a:font script="Ethi" typeface="Nyala"/>
-        <a:font script="Beng" typeface="Vrinda"/>
-        <a:font script="Gujr" typeface="Shruti"/>
-        <a:font script="Khmr" typeface="DaunPenh"/>
-        <a:font script="Knda" typeface="Tunga"/>
-        <a:font script="Guru" typeface="Raavi"/>
-        <a:font script="Cans" typeface="Euphemia"/>
-        <a:font script="Cher" typeface="Plantagenet Cherokee"/>
-        <a:font script="Yiii" typeface="Microsoft Yi Baiti"/>
-        <a:font script="Tibt" typeface="Microsoft Himalaya"/>
-        <a:font script="Thaa" typeface="MV Boli"/>
-        <a:font script="Deva" typeface="Mangal"/>
-        <a:font script="Telu" typeface="Gautami"/>
-        <a:font script="Taml" typeface="Latha"/>
-        <a:font script="Syrc" typeface="Estrangelo Edessa"/>
-        <a:font script="Orya" typeface="Kalinga"/>
-        <a:font script="Mlym" typeface="Kartika"/>
-        <a:font script="Laoo" typeface="DokChampa"/>
-        <a:font script="Sinh" typeface="Iskoola Pota"/>
-        <a:font script="Mong" typeface="Mongolian Baiti"/>
-        <a:font script="Viet" typeface="Arial"/>
-        <a:font script="Uigh" typeface="Microsoft Uighur"/>
-        <a:font script="Geor" typeface="Sylfaen"/>
-        <a:font script="Armn" typeface="Arial"/>
-        <a:font script="Bugi" typeface="Leelawadee UI"/>
-        <a:font script="Bopo" typeface="Microsoft JhengHei"/>
-        <a:font script="Java" typeface="Javanese Text"/>
-        <a:font script="Lisu" typeface="Segoe UI"/>
-        <a:font script="Mymr" typeface="Myanmar Text"/>
-        <a:font script="Nkoo" typeface="Ebrima"/>
-        <a:font script="Olck" typeface="Nirmala UI"/>
-        <a:font script="Osma" typeface="Ebrima"/>
-        <a:font script="Phag" typeface="Phagspa"/>
-        <a:font script="Syrn" typeface="Estrangelo Edessa"/>
-        <a:font script="Syrj" typeface="Estrangelo Edessa"/>
-        <a:font script="Syre" typeface="Estrangelo Edessa"/>
-        <a:font script="Sora" typeface="Nirmala UI"/>
-        <a:font script="Tale" typeface="Microsoft Tai Le"/>
-        <a:font script="Talu" typeface="Microsoft New Tai Lue"/>
-        <a:font script="Tfng" typeface="Ebrima"/>
+        <a:latin typeface="Times New Roman" panose="02110004020202020204"/>
+        <a:ea typeface="Times New Roman"/>
+        <a:cs typeface="Times New Roman"/>
+        <a:font script="Jpan" typeface="Times New Roman"/>
+        <a:font script="Hang" typeface="Times New Roman"/>
+        <a:font script="Hans" typeface="Times New Roman"/>
+        <a:font script="Hant" typeface="Times New Roman"/>
+        <a:font script="Arab" typeface="Times New Roman"/>
+        <a:font script="Hebr" typeface="Times New Roman"/>
+        <a:font script="Thai" typeface="Times New Roman"/>
+        <a:font script="Ethi" typeface="Times New Roman"/>
+        <a:font script="Beng" typeface="Times New Roman"/>
+        <a:font script="Gujr" typeface="Times New Roman"/>
+        <a:font script="Khmr" typeface="Times New Roman"/>
+        <a:font script="Knda" typeface="Times New Roman"/>
+        <a:font script="Guru" typeface="Times New Roman"/>
+        <a:font script="Cans" typeface="Times New Roman"/>
+        <a:font script="Cher" typeface="Times New Roman"/>
+        <a:font script="Yiii" typeface="Times New Roman"/>
+        <a:font script="Tibt" typeface="Times New Roman"/>
+        <a:font script="Thaa" typeface="Times New Roman"/>
+        <a:font script="Deva" typeface="Times New Roman"/>
+        <a:font script="Telu" typeface="Times New Roman"/>
+        <a:font script="Taml" typeface="Times New Roman"/>
+        <a:font script="Syrc" typeface="Times New Roman"/>
+        <a:font script="Orya" typeface="Times New Roman"/>
+        <a:font script="Mlym" typeface="Times New Roman"/>
+        <a:font script="Laoo" typeface="Times New Roman"/>
+        <a:font script="Sinh" typeface="Times New Roman"/>
+        <a:font script="Mong" typeface="Times New Roman"/>
+        <a:font script="Viet" typeface="Times New Roman"/>
+        <a:font script="Uigh" typeface="Times New Roman"/>
+        <a:font script="Geor" typeface="Times New Roman"/>
+        <a:font script="Armn" typeface="Times New Roman"/>
+        <a:font script="Bugi" typeface="Times New Roman"/>
+        <a:font script="Bopo" typeface="Times New Roman"/>
+        <a:font script="Java" typeface="Times New Roman"/>
+        <a:font script="Lisu" typeface="Times New Roman"/>
+        <a:font script="Mymr" typeface="Times New Roman"/>
+        <a:font script="Nkoo" typeface="Times New Roman"/>
+        <a:font script="Olck" typeface="Times New Roman"/>
+        <a:font script="Osma" typeface="Times New Roman"/>
+        <a:font script="Phag" typeface="Times New Roman"/>
+        <a:font script="Syrn" typeface="Times New Roman"/>
+        <a:font script="Syrj" typeface="Times New Roman"/>
+        <a:font script="Syre" typeface="Times New Roman"/>
+        <a:font script="Sora" typeface="Times New Roman"/>
+        <a:font script="Tale" typeface="Times New Roman"/>
+        <a:font script="Talu" typeface="Times New Roman"/>
+        <a:font script="Tfng" typeface="Times New Roman"/>
       </a:minorFont>
     </a:fontScheme>
     <a:fmtScheme name="Office">

</xml_diff>